<commit_message>
feat: complete keyframe annotation workflow
</commit_message>
<xml_diff>
--- a/sop-platform/docs/18_SOP平台完整使用说明_20260820.docx
+++ b/sop-platform/docs/18_SOP平台完整使用说明_20260820.docx
@@ -26,7 +26,7 @@
           <w:b w:val="0"/>
           <w:sz w:val="28"/>
         </w:rPr>
-        <w:t>版本：soplzp0820 / 2026-08-20</w:t>
+        <w:t>版本：soplzp0821-annotation-v2 / 2026-08-21</w:t>
       </w:r>
     </w:p>
     <w:p>
@@ -550,7 +550,7 @@
           <w:b w:val="0"/>
           <w:sz w:val="28"/>
         </w:rPr>
-        <w:t>标注员在 CVAT 中选择项目和 Task，播放整段视频，在关键帧画框后使用 Track/Interpolation 传播。完成后先保存，再将任务状态交给质量人员审核。PCB、手、电烙铁、夹具、镊子、刷子、电容、电感、螺钉和工位 ROI 必须分开标注。</w:t>
+        <w:t>标注员在 CVAT 中选择项目和 Task，播放整段视频，在关键帧画框后使用 Track/Interpolation 传播。完成后先保存，再将任务状态交给质量人员审核。标签必须服务于当前工位的质量判定目标，不得因为画面中出现了电容或电阻就无差别地全部标注。</w:t>
       </w:r>
     </w:p>
     <w:p>
@@ -577,7 +577,49 @@
           <w:b w:val="0"/>
           <w:sz w:val="28"/>
         </w:rPr>
-        <w:t>在“05 CVAT 标注”选择视频和区域，播放到关键帧后拖动鼠标画框，填写标签和轨迹编号，点击“保存这个框”。到下一个关键帧调整框后点击“插值到当前关键帧”，中间生成的框仍为待复核候选。</w:t>
+        <w:t>先在“固定工位标注口径”确认工位和质量目标。对于只处理两种物料的 PCB 固定工位，默认只标注 PCB 板、手部、相关物料框、手持插件和插件位置，不标注与判定无关的每个电容和电阻。二极管与其他插件只在选错会影响工艺结果时分成不同类别。</w:t>
+      </w:r>
+    </w:p>
+    <w:p>
+      <w:pPr>
+        <w:spacing w:line="360" w:lineRule="auto" w:after="120"/>
+      </w:pPr>
+      <w:r>
+        <w:rPr>
+          <w:rFonts w:ascii="Times New Roman" w:hAnsi="Times New Roman" w:eastAsia="KaiTi"/>
+          <w:b w:val="0"/>
+          <w:sz w:val="28"/>
+        </w:rPr>
+        <w:t xml:space="preserve">在“05 CVAT 标注”可点击播放/暂停，使用上一帧、下一帧、可配置跳帧数、时间轴或帧号输入直接定位。到起始帧画框后点击“设为起始关键帧”，到后续帧重画目标，再点击“生成轨迹到当前帧”。轨迹 ID 用于关联同一目标的多帧框，可留空自动生成，也可填写 </w:t>
+      </w:r>
+      <w:r>
+        <w:rPr>
+          <w:rFonts w:ascii="Times New Roman" w:hAnsi="Times New Roman" w:eastAsia="KaiTi"/>
+          <w:b/>
+          <w:sz w:val="28"/>
+        </w:rPr>
+        <w:t>diode-left-01</w:t>
+      </w:r>
+      <w:r>
+        <w:rPr>
+          <w:rFonts w:ascii="Times New Roman" w:hAnsi="Times New Roman" w:eastAsia="KaiTi"/>
+          <w:b w:val="0"/>
+          <w:sz w:val="28"/>
+        </w:rPr>
+        <w:t xml:space="preserve"> 类似的可读编号。</w:t>
+      </w:r>
+    </w:p>
+    <w:p>
+      <w:pPr>
+        <w:spacing w:line="360" w:lineRule="auto" w:after="120"/>
+      </w:pPr>
+      <w:r>
+        <w:rPr>
+          <w:rFonts w:ascii="Times New Roman" w:hAnsi="Times New Roman" w:eastAsia="KaiTi"/>
+          <w:b w:val="0"/>
+          <w:sz w:val="28"/>
+        </w:rPr>
+        <w:t>生成后，“当前视频轨迹”显示轨迹 ID、标签、起止帧、框数和生成帧号。已保存的人工框可直接删除，轨迹也可整条删除；检测预标注与小目标候选仍使用“驳回”。删除操作会留存审计记录。</w:t>
       </w:r>
     </w:p>
     <w:p>
@@ -1026,6 +1068,36 @@
           <w:b w:val="0"/>
           <w:sz w:val="28"/>
         </w:rPr>
+        <w:t xml:space="preserve">标注视频黑屏或显示格式错误：确认使用 H.264 网页代理视频并移除 DJI </w:t>
+      </w:r>
+      <w:r>
+        <w:rPr>
+          <w:rFonts w:ascii="Times New Roman" w:hAnsi="Times New Roman" w:eastAsia="KaiTi"/>
+          <w:b/>
+          <w:sz w:val="28"/>
+        </w:rPr>
+        <w:t>tmcd</w:t>
+      </w:r>
+      <w:r>
+        <w:rPr>
+          <w:rFonts w:ascii="Times New Roman" w:hAnsi="Times New Roman" w:eastAsia="KaiTi"/>
+          <w:b w:val="0"/>
+          <w:sz w:val="28"/>
+        </w:rPr>
+        <w:t xml:space="preserve"> 数据轨；本版 0264/0265 代理视频已完成无损重封装。</w:t>
+      </w:r>
+    </w:p>
+    <w:p>
+      <w:pPr>
+        <w:pStyle w:val="ListBullet"/>
+        <w:spacing w:line="360" w:lineRule="auto" w:after="120"/>
+      </w:pPr>
+      <w:r>
+        <w:rPr>
+          <w:rFonts w:ascii="Times New Roman" w:hAnsi="Times New Roman" w:eastAsia="KaiTi"/>
+          <w:b w:val="0"/>
+          <w:sz w:val="28"/>
+        </w:rPr>
         <w:t>三路画面延迟：降低显示宽度或 JPEG 质量，保持最新帧邮箱，不提高推理并发。</w:t>
       </w:r>
     </w:p>

</xml_diff>